<commit_message>
change bitbucket references to GitHub
</commit_message>
<xml_diff>
--- a/example/result/e20_url_in_paragraph.docx
+++ b/example/result/e20_url_in_paragraph.docx
@@ -48,7 +48,7 @@
             <w:color w:val="0000FF"/>
             <w:u w:val="single"/>
           </w:rPr>
-          <w:t>https://bitbucket.org/tom-bjorkholm/mformat/src/master/example</w:t>
+          <w:t>https://github.com/tom-bjorkholm/mformat/blob/master/example</w:t>
         </w:r>
       </w:hyperlink>
     </w:p>
@@ -85,7 +85,7 @@
       </w:hyperlink>
     </w:p>
     <w:sectPr>
-      <w:pgSz w:w="12240" w:h="15840"/>
+      <w:pgSz w:w="11906" w:h="16838"/>
       <w:pgMar w:top="1440" w:right="1800" w:bottom="1440" w:left="1800" w:header="720" w:footer="720" w:gutter="0"/>
       <w:cols w:space="720"/>
       <w:docGrid w:linePitch="360"/>

</xml_diff>